<commit_message>
Added more UCI documentation.
</commit_message>
<xml_diff>
--- a/doc/uci_http_target.docx
+++ b/doc/uci_http_target.docx
@@ -3954,7 +3954,7 @@
               <w:keepNext/>
             </w:pPr>
             <w:r>
-              <w:t>JSON</w:t>
+              <w:t>BINARY</w:t>
             </w:r>
           </w:p>
         </w:tc>
@@ -3990,7 +3990,7 @@
               <w:keepNext/>
             </w:pPr>
             <w:r>
-              <w:t>BINARY</w:t>
+              <w:t>JSON OBJECT</w:t>
             </w:r>
           </w:p>
         </w:tc>
@@ -4026,7 +4026,7 @@
               <w:keepNext/>
             </w:pPr>
             <w:r>
-              <w:t>URL ENCODED</w:t>
+              <w:t>JSON ARRAY</w:t>
             </w:r>
           </w:p>
         </w:tc>
@@ -4045,6 +4045,42 @@
           </w:p>
         </w:tc>
       </w:tr>
+      <w:tr>
+        <w:trPr>
+          <w:cnfStyle w:val="000000010000" w:firstRow="0" w:lastRow="0" w:firstColumn="0" w:lastColumn="0" w:oddVBand="0" w:evenVBand="0" w:oddHBand="0" w:evenHBand="1" w:firstRowFirstColumn="0" w:firstRowLastColumn="0" w:lastRowFirstColumn="0" w:lastRowLastColumn="0"/>
+        </w:trPr>
+        <w:tc>
+          <w:tcPr>
+            <w:cnfStyle w:val="001000000000" w:firstRow="0" w:lastRow="0" w:firstColumn="1" w:lastColumn="0" w:oddVBand="0" w:evenVBand="0" w:oddHBand="0" w:evenHBand="0" w:firstRowFirstColumn="0" w:firstRowLastColumn="0" w:lastRowFirstColumn="0" w:lastRowLastColumn="0"/>
+            <w:tcW w:w="2137" w:type="dxa"/>
+          </w:tcPr>
+          <w:p>
+            <w:pPr>
+              <w:keepNext/>
+            </w:pPr>
+            <w:r>
+              <w:t>URL ENCODED</w:t>
+            </w:r>
+          </w:p>
+        </w:tc>
+        <w:tc>
+          <w:tcPr>
+            <w:tcW w:w="0" w:type="auto"/>
+          </w:tcPr>
+          <w:p>
+            <w:pPr>
+              <w:keepNext/>
+              <w:cnfStyle w:val="000000010000" w:firstRow="0" w:lastRow="0" w:firstColumn="0" w:lastColumn="0" w:oddVBand="0" w:evenVBand="0" w:oddHBand="0" w:evenHBand="1" w:firstRowFirstColumn="0" w:firstRowLastColumn="0" w:lastRowFirstColumn="0" w:lastRowLastColumn="0"/>
+            </w:pPr>
+            <w:r>
+              <w:t>$0</w:t>
+            </w:r>
+            <w:r>
+              <w:t>4</w:t>
+            </w:r>
+          </w:p>
+        </w:tc>
+      </w:tr>
     </w:tbl>
     <w:p/>
     <w:p>
@@ -4089,13 +4125,13 @@
     </w:p>
     <w:p>
       <w:r>
-        <w:t>In case the data object is of the ‘JSON’</w:t>
-      </w:r>
-      <w:r>
-        <w:t xml:space="preserve"> or ‘URL ENCODED’</w:t>
-      </w:r>
-      <w:r>
-        <w:t xml:space="preserve"> type, it automatically opens the top level object, which could be represented as </w:t>
+        <w:t>In case the data object is of the ‘JSON</w:t>
+      </w:r>
+      <w:r>
+        <w:t xml:space="preserve"> OBJECT</w:t>
+      </w:r>
+      <w:r>
+        <w:t xml:space="preserve">’, it automatically opens the top level object, which could be represented as </w:t>
       </w:r>
       <w:r>
         <w:rPr>
@@ -4109,8 +4145,33 @@
       <w:r>
         <w:t xml:space="preserve"> This JSON body has a pointer associated to it, which can be moved to add items at the correct level of the hierarchy.</w:t>
       </w:r>
-      <w:r>
-        <w:t xml:space="preserve"> When the body type is ‘URL ENCODED’, the formatting of the body will be different, but the internal data structure is the same.</w:t>
+    </w:p>
+    <w:p>
+      <w:r>
+        <w:t>The body type that is initialized as a ‘JSON ARRAY’, starts with an object that could be represented as</w:t>
+      </w:r>
+      <w:r>
+        <w:br/>
+      </w:r>
+      <w:r>
+        <w:rPr>
+          <w:rStyle w:val="CodeChar"/>
+        </w:rPr>
+        <w:t>[ ]</w:t>
+      </w:r>
+      <w:r>
+        <w:t xml:space="preserve">. </w:t>
+      </w:r>
+      <w:r>
+        <w:t>Just like the JSON OBJECT, this body has a pointer associated to it.</w:t>
+      </w:r>
+    </w:p>
+    <w:p>
+      <w:r>
+        <w:t>When the body type is ‘URL ENCODED’, the formatting of the body will be different, but the internal data structure is the same</w:t>
+      </w:r>
+      <w:r>
+        <w:t xml:space="preserve"> as JSON OBJECT. The output generator will simply output an URL-encoded string. </w:t>
       </w:r>
     </w:p>
     <w:p>
@@ -4307,8 +4368,13 @@
         <w:t>}</w:t>
       </w:r>
     </w:p>
-    <w:p>
-      <w:r>
+    <w:p/>
+    <w:p>
+      <w:pPr>
+        <w:keepNext/>
+      </w:pPr>
+      <w:r>
+        <w:lastRenderedPageBreak/>
         <w:t>In URL encoded form, the body would look like this:</w:t>
       </w:r>
     </w:p>
@@ -4379,11 +4445,7 @@
         <w:t>data</w:t>
       </w:r>
       <w:r>
-        <w:t xml:space="preserve"> object, in the current object hierarchy. Since key names are variable in length, the command starts with a one-byte length indicator of the </w:t>
-      </w:r>
-      <w:r>
-        <w:lastRenderedPageBreak/>
-        <w:t>string. Then the string itself follows, exactly the number of bytes indicated. Then the value of the Boolean follows, always 1 byte in length.</w:t>
+        <w:t xml:space="preserve"> object, in the current object hierarchy. Since key names are variable in length, the command starts with a one-byte length indicator of the string. Then the string itself follows, exactly the number of bytes indicated. Then the value of the Boolean follows, always 1 byte in length.</w:t>
       </w:r>
     </w:p>
     <w:p>
@@ -4526,10 +4588,7 @@
         <w:pStyle w:val="Code"/>
       </w:pPr>
       <w:r>
-        <w:t>width=500</w:t>
-      </w:r>
-      <w:r>
-        <w:t>&amp;visible=true</w:t>
+        <w:t>width=500&amp;visible=true</w:t>
       </w:r>
     </w:p>
     <w:p>
@@ -4800,10 +4859,7 @@
         <w:pStyle w:val="Code"/>
       </w:pPr>
       <w:r>
-        <w:t>width=500</w:t>
-      </w:r>
-      <w:r>
-        <w:t>&amp;visible=</w:t>
+        <w:t>width=500&amp;visible=</w:t>
       </w:r>
       <w:proofErr w:type="spellStart"/>
       <w:r>
@@ -4891,7 +4947,11 @@
         <w:t>data</w:t>
       </w:r>
       <w:r>
-        <w:t xml:space="preserve"> object, in the current object hierarchy. Since key names are variable in length, the command starts with a one-byte length indicator of the string. Then the string itself follows, exactly the number of bytes indicated. This command does not take any</w:t>
+        <w:t xml:space="preserve"> object, in the current object hierarchy. Since key names are variable in length, the command starts with a one-byte length indicator of the </w:t>
+      </w:r>
+      <w:r>
+        <w:lastRenderedPageBreak/>
+        <w:t>string. Then the string itself follows, exactly the number of bytes indicated. This command does not take any</w:t>
       </w:r>
       <w:r>
         <w:t xml:space="preserve"> value.</w:t>
@@ -4978,7 +5038,6 @@
         <w:pStyle w:val="Code"/>
       </w:pPr>
       <w:r>
-        <w:lastRenderedPageBreak/>
         <w:t>{</w:t>
       </w:r>
     </w:p>
@@ -5044,10 +5103,7 @@
       </w:r>
       <w:proofErr w:type="spellEnd"/>
       <w:r>
-        <w:t>=Commodore%20Intl</w:t>
-      </w:r>
-      <w:r>
-        <w:t>&amp;user=%7B%7D</w:t>
+        <w:t>=Commodore%20Intl&amp;user=%7B%7D</w:t>
       </w:r>
     </w:p>
     <w:p>
@@ -5337,7 +5393,11 @@
         <w:t>s</w:t>
       </w:r>
       <w:r>
-        <w:t xml:space="preserve"> the addition of items in the current level. The command does not take any arguments. Note that it is not required to step all the way up to the root for the </w:t>
+        <w:t xml:space="preserve"> the addition of items in the current level. The command does not take any arguments. Note that it is not required to </w:t>
+      </w:r>
+      <w:r>
+        <w:lastRenderedPageBreak/>
+        <w:t xml:space="preserve">step all the way up to the root for the </w:t>
       </w:r>
       <w:r>
         <w:t>data</w:t>
@@ -5400,7 +5460,6 @@
         <w:pStyle w:val="Code"/>
       </w:pPr>
       <w:r>
-        <w:lastRenderedPageBreak/>
         <w:t>{</w:t>
       </w:r>
     </w:p>
@@ -5765,6 +5824,7 @@
               <w:keepNext/>
             </w:pPr>
             <w:r>
+              <w:lastRenderedPageBreak/>
               <w:t>Type</w:t>
             </w:r>
           </w:p>
@@ -5967,6 +6027,332 @@
         <w:pStyle w:val="Code"/>
       </w:pPr>
       <w:r>
+        <w:t>{</w:t>
+      </w:r>
+    </w:p>
+    <w:p>
+      <w:pPr>
+        <w:pStyle w:val="Code"/>
+      </w:pPr>
+      <w:r>
+        <w:t xml:space="preserve">    “width” : 500,</w:t>
+      </w:r>
+    </w:p>
+    <w:p>
+      <w:pPr>
+        <w:pStyle w:val="Code"/>
+      </w:pPr>
+      <w:r>
+        <w:t xml:space="preserve">    “visible” : true,</w:t>
+      </w:r>
+      <w:r>
+        <w:br/>
+        <w:t xml:space="preserve">    “title” : “Commodore”,</w:t>
+      </w:r>
+    </w:p>
+    <w:p>
+      <w:pPr>
+        <w:pStyle w:val="Code"/>
+      </w:pPr>
+      <w:r>
+        <w:t xml:space="preserve">    “user” : { </w:t>
+      </w:r>
+    </w:p>
+    <w:p>
+      <w:pPr>
+        <w:pStyle w:val="Code"/>
+      </w:pPr>
+      <w:r>
+        <w:t xml:space="preserve">        “name” : “Peri”</w:t>
+      </w:r>
+    </w:p>
+    <w:p>
+      <w:pPr>
+        <w:pStyle w:val="Code"/>
+      </w:pPr>
+      <w:r>
+        <w:t xml:space="preserve">    }</w:t>
+      </w:r>
+    </w:p>
+    <w:p>
+      <w:pPr>
+        <w:pStyle w:val="Code"/>
+      </w:pPr>
+      <w:r>
+        <w:t>}</w:t>
+      </w:r>
+    </w:p>
+    <w:p>
+      <w:r>
+        <w:t xml:space="preserve">Example: </w:t>
+      </w:r>
+      <w:r>
+        <w:rPr>
+          <w:rStyle w:val="CodeChar"/>
+        </w:rPr>
+        <w:t>$06 $2A $XX “user/name”</w:t>
+      </w:r>
+      <w:r>
+        <w:t xml:space="preserve"> will result in a data message </w:t>
+      </w:r>
+      <w:r>
+        <w:rPr>
+          <w:rStyle w:val="CodeChar"/>
+        </w:rPr>
+        <w:t>$03 “</w:t>
+      </w:r>
+      <w:r>
+        <w:rPr>
+          <w:rStyle w:val="CodeChar"/>
+        </w:rPr>
+        <w:t>Peri</w:t>
+      </w:r>
+      <w:r>
+        <w:rPr>
+          <w:rStyle w:val="CodeChar"/>
+        </w:rPr>
+        <w:t>”</w:t>
+      </w:r>
+      <w:r>
+        <w:t>, without the quotes</w:t>
+      </w:r>
+      <w:r>
+        <w:t>.</w:t>
+      </w:r>
+    </w:p>
+    <w:p>
+      <w:r>
+        <w:t xml:space="preserve">The status channel will read </w:t>
+      </w:r>
+      <w:r>
+        <w:rPr>
+          <w:rStyle w:val="CodeChar"/>
+        </w:rPr>
+        <w:t>000 OK</w:t>
+      </w:r>
+      <w:r>
+        <w:t xml:space="preserve"> when the path is valid and the value is returned. When the handle is valid, but the path does not lead to a known value, the status will be set to </w:t>
+      </w:r>
+      <w:r>
+        <w:rPr>
+          <w:rStyle w:val="CodeChar"/>
+        </w:rPr>
+        <w:t>404 ENTRY NOT FOUND</w:t>
+      </w:r>
+      <w:r>
+        <w:t xml:space="preserve">. In case the handle is invalid, the status will be set to </w:t>
+      </w:r>
+      <w:r>
+        <w:rPr>
+          <w:rStyle w:val="CodeChar"/>
+        </w:rPr>
+        <w:t>400 BAD REQUEST</w:t>
+      </w:r>
+      <w:r>
+        <w:t>.</w:t>
+      </w:r>
+    </w:p>
+    <w:p>
+      <w:r>
+        <w:t xml:space="preserve">Indexing arrays is possible by using the % prefix. In case the object looks like this, the path </w:t>
+      </w:r>
+      <w:r>
+        <w:rPr>
+          <w:rStyle w:val="CodeChar"/>
+        </w:rPr>
+        <w:t>user/cars%2</w:t>
+      </w:r>
+      <w:r>
+        <w:t xml:space="preserve"> would return </w:t>
+      </w:r>
+      <w:r>
+        <w:rPr>
+          <w:rStyle w:val="CodeChar"/>
+        </w:rPr>
+        <w:t>$03 “Toyota”</w:t>
+      </w:r>
+      <w:r>
+        <w:t>.</w:t>
+      </w:r>
+    </w:p>
+    <w:p>
+      <w:pPr>
+        <w:pStyle w:val="Code"/>
+      </w:pPr>
+      <w:r>
+        <w:t>{</w:t>
+      </w:r>
+    </w:p>
+    <w:p>
+      <w:pPr>
+        <w:pStyle w:val="Code"/>
+      </w:pPr>
+      <w:r>
+        <w:t>    “width” : 500,</w:t>
+      </w:r>
+    </w:p>
+    <w:p>
+      <w:pPr>
+        <w:pStyle w:val="Code"/>
+      </w:pPr>
+      <w:r>
+        <w:t>    “visible” : true,</w:t>
+      </w:r>
+      <w:r>
+        <w:br/>
+        <w:t>    “title” : “Commodore”,</w:t>
+      </w:r>
+    </w:p>
+    <w:p>
+      <w:pPr>
+        <w:pStyle w:val="Code"/>
+      </w:pPr>
+      <w:r>
+        <w:t>    “user” : {</w:t>
+      </w:r>
+    </w:p>
+    <w:p>
+      <w:pPr>
+        <w:pStyle w:val="Code"/>
+      </w:pPr>
+      <w:r>
+        <w:t>        “cars” : [ "Opel", "Renault", "Toyota", "Mitsubishi", "Mercedes" ]</w:t>
+      </w:r>
+    </w:p>
+    <w:p>
+      <w:pPr>
+        <w:pStyle w:val="Code"/>
+      </w:pPr>
+      <w:r>
+        <w:t>    }</w:t>
+      </w:r>
+    </w:p>
+    <w:p>
+      <w:pPr>
+        <w:pStyle w:val="Code"/>
+      </w:pPr>
+      <w:r>
+        <w:t>}</w:t>
+      </w:r>
+    </w:p>
+    <w:p>
+      <w:r>
+        <w:t>When the top level object is an array, the path can start with an index:</w:t>
+      </w:r>
+    </w:p>
+    <w:p>
+      <w:pPr>
+        <w:pStyle w:val="Code"/>
+      </w:pPr>
+      <w:r>
+        <w:t>[</w:t>
+      </w:r>
+    </w:p>
+    <w:p>
+      <w:pPr>
+        <w:pStyle w:val="Code"/>
+      </w:pPr>
+      <w:r>
+        <w:t xml:space="preserve">    { “user” : “1541u”, “name”: “Gideon” },</w:t>
+      </w:r>
+    </w:p>
+    <w:p>
+      <w:pPr>
+        <w:pStyle w:val="Code"/>
+      </w:pPr>
+      <w:r>
+        <w:t xml:space="preserve">    { “user” : “bvl1999”, “name”: “Bart” }</w:t>
+      </w:r>
+    </w:p>
+    <w:p>
+      <w:pPr>
+        <w:pStyle w:val="Code"/>
+      </w:pPr>
+      <w:r>
+        <w:t>]</w:t>
+      </w:r>
+    </w:p>
+    <w:p>
+      <w:r>
+        <w:t xml:space="preserve">In this case the path </w:t>
+      </w:r>
+      <w:r>
+        <w:rPr>
+          <w:rStyle w:val="CodeChar"/>
+        </w:rPr>
+        <w:t>%1/name</w:t>
+      </w:r>
+      <w:r>
+        <w:t xml:space="preserve"> would return </w:t>
+      </w:r>
+      <w:r>
+        <w:rPr>
+          <w:rStyle w:val="CodeChar"/>
+        </w:rPr>
+        <w:t>$03 “Bart”</w:t>
+      </w:r>
+      <w:r>
+        <w:t>.</w:t>
+      </w:r>
+    </w:p>
+    <w:p>
+      <w:pPr>
+        <w:pStyle w:val="Heading2"/>
+      </w:pPr>
+      <w:bookmarkStart w:id="23" w:name="_Toc224300922"/>
+      <w:r>
+        <w:t>HTTP_CMD_BODY</w:t>
+      </w:r>
+      <w:r>
+        <w:t>_MOVE (0x2B)</w:t>
+      </w:r>
+      <w:bookmarkEnd w:id="23"/>
+    </w:p>
+    <w:p>
+      <w:r>
+        <w:t xml:space="preserve">Command format: </w:t>
+      </w:r>
+      <w:r>
+        <w:rPr>
+          <w:rStyle w:val="CodeChar"/>
+        </w:rPr>
+        <w:t>$06 $2</w:t>
+      </w:r>
+      <w:r>
+        <w:rPr>
+          <w:rStyle w:val="CodeChar"/>
+        </w:rPr>
+        <w:t>B</w:t>
+      </w:r>
+      <w:r>
+        <w:rPr>
+          <w:rStyle w:val="CodeChar"/>
+        </w:rPr>
+        <w:t xml:space="preserve"> &lt;HANDLE&gt; &lt;PATH&gt;</w:t>
+      </w:r>
+    </w:p>
+    <w:p>
+      <w:r>
+        <w:t xml:space="preserve">Use the Move command to position the cursor somewhere in the </w:t>
+      </w:r>
+      <w:r>
+        <w:t>data object</w:t>
+      </w:r>
+      <w:r>
+        <w:t xml:space="preserve"> hierarchy, in order to add (or set) values. The </w:t>
+      </w:r>
+      <w:r>
+        <w:t>p</w:t>
+      </w:r>
+      <w:r>
+        <w:t>ath is a string that leads to the entry of interest. Let’s say the object looks like this:</w:t>
+      </w:r>
+    </w:p>
+    <w:p>
+      <w:pPr>
+        <w:pStyle w:val="Code"/>
+      </w:pPr>
+      <w:r>
         <w:lastRenderedPageBreak/>
         <w:t>{</w:t>
       </w:r>
@@ -6031,57 +6417,113 @@
         <w:rPr>
           <w:rStyle w:val="CodeChar"/>
         </w:rPr>
-        <w:t>$06 $2A $XX “user/name”</w:t>
-      </w:r>
-      <w:r>
-        <w:t xml:space="preserve"> will result in a data message </w:t>
-      </w:r>
-      <w:r>
-        <w:rPr>
-          <w:rStyle w:val="CodeChar"/>
-        </w:rPr>
-        <w:t>$03 “</w:t>
-      </w:r>
-      <w:r>
-        <w:rPr>
-          <w:rStyle w:val="CodeChar"/>
-        </w:rPr>
-        <w:t>Peri</w:t>
-      </w:r>
-      <w:r>
-        <w:rPr>
-          <w:rStyle w:val="CodeChar"/>
-        </w:rPr>
-        <w:t>”</w:t>
-      </w:r>
-      <w:r>
-        <w:t>, without the quotes</w:t>
+        <w:t>$06 $2</w:t>
+      </w:r>
+      <w:r>
+        <w:rPr>
+          <w:rStyle w:val="CodeChar"/>
+        </w:rPr>
+        <w:t>B</w:t>
+      </w:r>
+      <w:r>
+        <w:rPr>
+          <w:rStyle w:val="CodeChar"/>
+        </w:rPr>
+        <w:t xml:space="preserve"> $XX “user”</w:t>
+      </w:r>
+      <w:r>
+        <w:t xml:space="preserve"> will make the cursor move into the object “user”, alongside the key “name”.</w:t>
+      </w:r>
+    </w:p>
+    <w:p>
+      <w:r>
+        <w:t xml:space="preserve">The status channel will read </w:t>
+      </w:r>
+      <w:r>
+        <w:rPr>
+          <w:rStyle w:val="CodeChar"/>
+        </w:rPr>
+        <w:t>000 OK</w:t>
+      </w:r>
+      <w:r>
+        <w:t xml:space="preserve"> when the path is valid and points to an object or to an array. When the handle is valid, but the path does not lead to an object or an array, the status will be set to </w:t>
+      </w:r>
+      <w:r>
+        <w:rPr>
+          <w:rStyle w:val="CodeChar"/>
+        </w:rPr>
+        <w:t>404 ENTRY NOT FOUND</w:t>
+      </w:r>
+      <w:r>
+        <w:t xml:space="preserve">. In case the handle is invalid, the status will be set to </w:t>
+      </w:r>
+      <w:r>
+        <w:rPr>
+          <w:rStyle w:val="CodeChar"/>
+        </w:rPr>
+        <w:t>400 BAD REQUEST</w:t>
       </w:r>
       <w:r>
         <w:t>.</w:t>
       </w:r>
     </w:p>
     <w:p>
-      <w:r>
-        <w:t xml:space="preserve">The status channel will read </w:t>
-      </w:r>
-      <w:r>
-        <w:rPr>
-          <w:rStyle w:val="CodeChar"/>
-        </w:rPr>
-        <w:t>000 OK</w:t>
-      </w:r>
-      <w:r>
-        <w:t xml:space="preserve"> when the path is valid and the value is returned. When the handle is valid, but the path does not lead to a known value, the status will be set to </w:t>
-      </w:r>
-      <w:r>
-        <w:rPr>
-          <w:rStyle w:val="CodeChar"/>
-        </w:rPr>
-        <w:t>404 ENTRY NOT FOUND</w:t>
-      </w:r>
-      <w:r>
-        <w:t xml:space="preserve">. In case the handle is invalid, the status will be set to </w:t>
+      <w:pPr>
+        <w:pStyle w:val="Heading2"/>
+      </w:pPr>
+      <w:bookmarkStart w:id="24" w:name="_Toc224300923"/>
+      <w:r>
+        <w:t>HTTP_CMD_</w:t>
+      </w:r>
+      <w:r>
+        <w:t>BODY_</w:t>
+      </w:r>
+      <w:r>
+        <w:t>ADD_BINARY (0x2C)</w:t>
+      </w:r>
+      <w:bookmarkEnd w:id="24"/>
+    </w:p>
+    <w:p>
+      <w:r>
+        <w:t xml:space="preserve">Command format: </w:t>
+      </w:r>
+      <w:r>
+        <w:rPr>
+          <w:rStyle w:val="CodeChar"/>
+        </w:rPr>
+        <w:t>$06 $2</w:t>
+      </w:r>
+      <w:r>
+        <w:rPr>
+          <w:rStyle w:val="CodeChar"/>
+        </w:rPr>
+        <w:t>C</w:t>
+      </w:r>
+      <w:r>
+        <w:rPr>
+          <w:rStyle w:val="CodeChar"/>
+        </w:rPr>
+        <w:t xml:space="preserve"> &lt;HANDLE&gt; &lt;</w:t>
+      </w:r>
+      <w:r>
+        <w:rPr>
+          <w:rStyle w:val="CodeChar"/>
+        </w:rPr>
+        <w:t>Binary Data</w:t>
+      </w:r>
+      <w:r>
+        <w:rPr>
+          <w:rStyle w:val="CodeChar"/>
+        </w:rPr>
+        <w:t>&gt;</w:t>
+      </w:r>
+    </w:p>
+    <w:p>
+      <w:r>
+        <w:t xml:space="preserve">The command can be used to add binary data to body handle that is of the binary type. When the handle points to another type, </w:t>
+      </w:r>
+      <w:r>
+        <w:t xml:space="preserve">the status channel returns </w:t>
       </w:r>
       <w:r>
         <w:rPr>
@@ -6090,21 +6532,21 @@
         <w:t>400 BAD REQUEST</w:t>
       </w:r>
       <w:r>
-        <w:t>.</w:t>
+        <w:t>. Multiple additions of binary data can be done when the size of the data exceeds what can be sent in one command. The maximum command size to the UCI is 896 bytes.</w:t>
       </w:r>
     </w:p>
     <w:p>
       <w:pPr>
         <w:pStyle w:val="Heading2"/>
       </w:pPr>
-      <w:bookmarkStart w:id="23" w:name="_Toc224300922"/>
-      <w:r>
-        <w:t>HTTP_CMD_BODY</w:t>
-      </w:r>
-      <w:r>
-        <w:t>_MOVE (0x2B)</w:t>
-      </w:r>
-      <w:bookmarkEnd w:id="23"/>
+      <w:bookmarkStart w:id="25" w:name="_Toc224300924"/>
+      <w:r>
+        <w:t>HTTP_</w:t>
+      </w:r>
+      <w:r>
+        <w:t>CMD_DO_EXCHANGE_OBJ (0x31)</w:t>
+      </w:r>
+      <w:bookmarkEnd w:id="25"/>
     </w:p>
     <w:p>
       <w:r>
@@ -6114,251 +6556,11 @@
         <w:rPr>
           <w:rStyle w:val="CodeChar"/>
         </w:rPr>
-        <w:t>$06 $2</w:t>
-      </w:r>
-      <w:r>
-        <w:rPr>
-          <w:rStyle w:val="CodeChar"/>
-        </w:rPr>
-        <w:t>B</w:t>
-      </w:r>
-      <w:r>
-        <w:rPr>
-          <w:rStyle w:val="CodeChar"/>
-        </w:rPr>
-        <w:t xml:space="preserve"> &lt;HANDLE&gt; &lt;PATH&gt;</w:t>
-      </w:r>
-    </w:p>
-    <w:p>
-      <w:r>
-        <w:t xml:space="preserve">Use the Move command to position the cursor somewhere in the </w:t>
-      </w:r>
-      <w:r>
-        <w:t>data object</w:t>
-      </w:r>
-      <w:r>
-        <w:t xml:space="preserve"> hierarchy, in order to add (or set) values. The </w:t>
-      </w:r>
-      <w:r>
-        <w:t>p</w:t>
-      </w:r>
-      <w:r>
-        <w:t>ath is a string that leads to the entry of interest. Let’s say the object looks like this:</w:t>
-      </w:r>
-    </w:p>
-    <w:p>
-      <w:pPr>
-        <w:pStyle w:val="Code"/>
-      </w:pPr>
-      <w:r>
-        <w:t>{</w:t>
-      </w:r>
-    </w:p>
-    <w:p>
-      <w:pPr>
-        <w:pStyle w:val="Code"/>
-      </w:pPr>
-      <w:r>
-        <w:t xml:space="preserve">    “width” : 500,</w:t>
-      </w:r>
-    </w:p>
-    <w:p>
-      <w:pPr>
-        <w:pStyle w:val="Code"/>
-      </w:pPr>
-      <w:r>
-        <w:t xml:space="preserve">    “visible” : true,</w:t>
-      </w:r>
-      <w:r>
-        <w:br/>
-        <w:t xml:space="preserve">    “title” : “Commodore”,</w:t>
-      </w:r>
-    </w:p>
-    <w:p>
-      <w:pPr>
-        <w:pStyle w:val="Code"/>
-      </w:pPr>
-      <w:r>
-        <w:t xml:space="preserve">    “user” : { </w:t>
-      </w:r>
-    </w:p>
-    <w:p>
-      <w:pPr>
-        <w:pStyle w:val="Code"/>
-      </w:pPr>
-      <w:r>
-        <w:t xml:space="preserve">        “name” : “Peri”</w:t>
-      </w:r>
-    </w:p>
-    <w:p>
-      <w:pPr>
-        <w:pStyle w:val="Code"/>
-      </w:pPr>
-      <w:r>
-        <w:t xml:space="preserve">    }</w:t>
-      </w:r>
-    </w:p>
-    <w:p>
-      <w:pPr>
-        <w:pStyle w:val="Code"/>
-      </w:pPr>
-      <w:r>
-        <w:t>}</w:t>
-      </w:r>
-    </w:p>
-    <w:p>
-      <w:r>
-        <w:t xml:space="preserve">Example: </w:t>
-      </w:r>
-      <w:r>
-        <w:rPr>
-          <w:rStyle w:val="CodeChar"/>
-        </w:rPr>
-        <w:t>$06 $2</w:t>
-      </w:r>
-      <w:r>
-        <w:rPr>
-          <w:rStyle w:val="CodeChar"/>
-        </w:rPr>
-        <w:t>B</w:t>
-      </w:r>
-      <w:r>
-        <w:rPr>
-          <w:rStyle w:val="CodeChar"/>
-        </w:rPr>
-        <w:t xml:space="preserve"> $XX “user”</w:t>
-      </w:r>
-      <w:r>
-        <w:t xml:space="preserve"> will make the cursor move into the object “user”, alongside the key “name”.</w:t>
-      </w:r>
-    </w:p>
-    <w:p>
-      <w:r>
-        <w:t xml:space="preserve">The status channel will read </w:t>
-      </w:r>
-      <w:r>
-        <w:rPr>
-          <w:rStyle w:val="CodeChar"/>
-        </w:rPr>
-        <w:t>000 OK</w:t>
-      </w:r>
-      <w:r>
-        <w:t xml:space="preserve"> when the path is valid and points to an object or to an array. When the handle is valid, but the path does not lead to an object or an array, the status will be set to </w:t>
-      </w:r>
-      <w:r>
-        <w:rPr>
-          <w:rStyle w:val="CodeChar"/>
-        </w:rPr>
-        <w:t>404 ENTRY NOT FOUND</w:t>
-      </w:r>
-      <w:r>
-        <w:t xml:space="preserve">. In case the handle is invalid, the status will be set to </w:t>
-      </w:r>
-      <w:r>
-        <w:rPr>
-          <w:rStyle w:val="CodeChar"/>
-        </w:rPr>
-        <w:t>400 BAD REQUEST</w:t>
-      </w:r>
-      <w:r>
-        <w:t>.</w:t>
-      </w:r>
-    </w:p>
-    <w:p>
-      <w:pPr>
-        <w:pStyle w:val="Heading2"/>
-      </w:pPr>
-      <w:bookmarkStart w:id="24" w:name="_Toc224300923"/>
-      <w:r>
-        <w:t>HTTP_CMD_</w:t>
-      </w:r>
-      <w:r>
-        <w:t>BODY_</w:t>
-      </w:r>
-      <w:r>
-        <w:t>ADD_BINARY (0x2C)</w:t>
-      </w:r>
-      <w:bookmarkEnd w:id="24"/>
-    </w:p>
-    <w:p>
-      <w:r>
-        <w:t xml:space="preserve">Command format: </w:t>
-      </w:r>
-      <w:r>
-        <w:rPr>
-          <w:rStyle w:val="CodeChar"/>
-        </w:rPr>
-        <w:t>$06 $2</w:t>
-      </w:r>
-      <w:r>
-        <w:rPr>
-          <w:rStyle w:val="CodeChar"/>
-        </w:rPr>
-        <w:t>C</w:t>
-      </w:r>
-      <w:r>
-        <w:rPr>
-          <w:rStyle w:val="CodeChar"/>
-        </w:rPr>
-        <w:t xml:space="preserve"> &lt;HANDLE&gt; &lt;</w:t>
-      </w:r>
-      <w:r>
-        <w:rPr>
-          <w:rStyle w:val="CodeChar"/>
-        </w:rPr>
-        <w:t>Binary Data</w:t>
-      </w:r>
-      <w:r>
-        <w:rPr>
-          <w:rStyle w:val="CodeChar"/>
-        </w:rPr>
-        <w:t>&gt;</w:t>
-      </w:r>
-    </w:p>
-    <w:p>
-      <w:r>
-        <w:t xml:space="preserve">The command can be used to add binary data to body handle that is of the binary type. When the handle points to another type, </w:t>
-      </w:r>
-      <w:r>
-        <w:t xml:space="preserve">the status channel returns </w:t>
-      </w:r>
-      <w:r>
-        <w:rPr>
-          <w:rStyle w:val="CodeChar"/>
-        </w:rPr>
-        <w:t>400 BAD REQUEST</w:t>
-      </w:r>
-      <w:r>
-        <w:t>. Multiple additions of binary data can be done when the size of the data exceeds what can be sent in one command. The maximum command size to the UCI is 896 bytes.</w:t>
-      </w:r>
-    </w:p>
-    <w:p>
-      <w:pPr>
-        <w:pStyle w:val="Heading2"/>
-      </w:pPr>
-      <w:bookmarkStart w:id="25" w:name="_Toc224300924"/>
-      <w:r>
-        <w:t>HTTP_</w:t>
-      </w:r>
-      <w:r>
-        <w:t>CMD_DO_EXCHANGE_OBJ (0x31)</w:t>
-      </w:r>
-      <w:bookmarkEnd w:id="25"/>
-    </w:p>
-    <w:p>
-      <w:r>
-        <w:t xml:space="preserve">Command format: </w:t>
-      </w:r>
-      <w:r>
-        <w:rPr>
-          <w:rStyle w:val="CodeChar"/>
-        </w:rPr>
         <w:t>$06 $31 &lt;HEADER&gt; &lt;BODY&gt;</w:t>
       </w:r>
     </w:p>
     <w:p>
       <w:r>
-        <w:lastRenderedPageBreak/>
         <w:t xml:space="preserve">This command performs the HTTP exchange on the network. It references the URL and header with the first byte, and the optional data body with the second byte. When no body is to be sent, </w:t>
       </w:r>
       <w:r>
@@ -9822,6 +10024,7 @@
     <w:rsid w:val="00AE1B17"/>
     <w:rsid w:val="00AE7445"/>
     <w:rsid w:val="00B8324E"/>
+    <w:rsid w:val="00C75739"/>
     <w:rsid w:val="00C76122"/>
     <w:rsid w:val="00D37488"/>
     <w:rsid w:val="00D53DC1"/>

</xml_diff>